<commit_message>
V2 alignment: judging-criteria tables + five evidence keywords + case report docx (zhongxin-paradigm conclusions); platform files replaced
</commit_message>
<xml_diff>
--- a/teaching_doc/教学指导文档.docx
+++ b/teaching_doc/教学指导文档.docx
@@ -731,6 +731,295 @@
           <w:sz w:val="24"/>
         </w:rPr>
         <w:t>两套课堂组织方案（见第四节），分别对应“完整走一遍主链路”与“含反事实设计工作坊与正式答辩”的两种教学深度。</w:t>
+      </w:r>
+    </w:p>
+    <w:p>
+      <w:pPr>
+        <w:spacing w:before="200" w:after="80"/>
+      </w:pPr>
+      <w:r>
+        <w:rPr>
+          <w:rFonts w:ascii="Times New Roman" w:hAnsi="Times New Roman" w:eastAsia="黑体"/>
+          <w:b/>
+          <w:color w:val="2E5E8C"/>
+          <w:sz w:val="27"/>
+        </w:rPr>
+        <w:t>1.6　与大赛评分判据的对齐（教师备课索引）</w:t>
+      </w:r>
+    </w:p>
+    <w:p>
+      <w:pPr>
+        <w:spacing w:after="80" w:line="307" w:lineRule="auto"/>
+        <w:ind w:firstLine="480"/>
+      </w:pPr>
+      <w:r>
+        <w:rPr>
+          <w:rFonts w:ascii="Times New Roman" w:hAnsi="Times New Roman" w:eastAsia="宋体"/>
+          <w:b w:val="0"/>
+          <w:sz w:val="24"/>
+        </w:rPr>
+        <w:t>大赛评审以“人工智能在投研决策链条中所处环节、及其与最终交易决策的拟合程度”为核心依据，以可验证证据为基础，且要求 AI 实质介入决策生成。本案例的对应落点如下，供教师备课与指导学生答辩时使用：</w:t>
+      </w:r>
+    </w:p>
+    <w:tbl>
+      <w:tblPr>
+        <w:tblStyle w:val="TableGrid"/>
+        <w:tblW w:type="auto" w:w="0"/>
+        <w:jc w:val="center"/>
+        <w:tblLook w:firstColumn="1" w:firstRow="1" w:lastColumn="0" w:lastRow="0" w:noHBand="0" w:noVBand="1" w:val="04A0"/>
+      </w:tblPr>
+      <w:tblGrid>
+        <w:gridCol w:w="3324"/>
+        <w:gridCol w:w="3324"/>
+        <w:gridCol w:w="3324"/>
+      </w:tblGrid>
+      <w:tr>
+        <w:tc>
+          <w:tcPr>
+            <w:tcW w:type="dxa" w:w="2948"/>
+            <w:shd w:val="clear" w:color="auto" w:fill="DCE6F1"/>
+          </w:tcPr>
+          <w:p>
+            <w:pPr>
+              <w:jc w:val="center"/>
+            </w:pPr>
+            <w:r/>
+            <w:r>
+              <w:rPr>
+                <w:rFonts w:ascii="Times New Roman" w:hAnsi="Times New Roman" w:eastAsia="黑体"/>
+                <w:b/>
+                <w:sz w:val="19"/>
+              </w:rPr>
+              <w:t>评分判据</w:t>
+            </w:r>
+          </w:p>
+        </w:tc>
+        <w:tc>
+          <w:tcPr>
+            <w:tcW w:type="dxa" w:w="4082"/>
+            <w:shd w:val="clear" w:color="auto" w:fill="DCE6F1"/>
+          </w:tcPr>
+          <w:p>
+            <w:pPr>
+              <w:jc w:val="center"/>
+            </w:pPr>
+            <w:r/>
+            <w:r>
+              <w:rPr>
+                <w:rFonts w:ascii="Times New Roman" w:hAnsi="Times New Roman" w:eastAsia="黑体"/>
+                <w:b/>
+                <w:sz w:val="19"/>
+              </w:rPr>
+              <w:t>本案例落点</w:t>
+            </w:r>
+          </w:p>
+        </w:tc>
+        <w:tc>
+          <w:tcPr>
+            <w:tcW w:type="dxa" w:w="2494"/>
+            <w:shd w:val="clear" w:color="auto" w:fill="DCE6F1"/>
+          </w:tcPr>
+          <w:p>
+            <w:pPr>
+              <w:jc w:val="center"/>
+            </w:pPr>
+            <w:r/>
+            <w:r>
+              <w:rPr>
+                <w:rFonts w:ascii="Times New Roman" w:hAnsi="Times New Roman" w:eastAsia="黑体"/>
+                <w:b/>
+                <w:sz w:val="19"/>
+              </w:rPr>
+              <w:t>课堂 / 答辩话术</w:t>
+            </w:r>
+          </w:p>
+        </w:tc>
+      </w:tr>
+      <w:tr>
+        <w:tc>
+          <w:tcPr>
+            <w:tcW w:type="dxa" w:w="2948"/>
+          </w:tcPr>
+          <w:p>
+            <w:r/>
+            <w:r>
+              <w:rPr>
+                <w:rFonts w:ascii="Times New Roman" w:hAnsi="Times New Roman" w:eastAsia="宋体"/>
+                <w:b w:val="0"/>
+                <w:sz w:val="19"/>
+              </w:rPr>
+              <w:t>以 AI 所处环节及其与最终交易决策的拟合程度为核心依据</w:t>
+            </w:r>
+          </w:p>
+        </w:tc>
+        <w:tc>
+          <w:tcPr>
+            <w:tcW w:type="dxa" w:w="4082"/>
+          </w:tcPr>
+          <w:p>
+            <w:r/>
+            <w:r>
+              <w:rPr>
+                <w:rFonts w:ascii="Times New Roman" w:hAnsi="Times New Roman" w:eastAsia="宋体"/>
+                <w:b w:val="0"/>
+                <w:sz w:val="19"/>
+              </w:rPr>
+              <w:t>案例把“信号→仓位”环节整体搬进沙盘：AI 方向与置信度经仓位规则直接决定组合权重，移除信号则决策链失效；</w:t>
+            </w:r>
+            <w:r>
+              <w:rPr>
+                <w:rFonts w:ascii="Times New Roman" w:hAnsi="Times New Roman" w:eastAsia="宋体"/>
+                <w:b/>
+                <w:sz w:val="19"/>
+              </w:rPr>
+              <w:t>人工仅设硬约束</w:t>
+            </w:r>
+            <w:r>
+              <w:rPr>
+                <w:rFonts w:ascii="Times New Roman" w:hAnsi="Times New Roman" w:eastAsia="宋体"/>
+                <w:b w:val="0"/>
+                <w:sz w:val="19"/>
+              </w:rPr>
+              <w:t>（成本、集中度、回撤预算）</w:t>
+            </w:r>
+          </w:p>
+        </w:tc>
+        <w:tc>
+          <w:tcPr>
+            <w:tcW w:type="dxa" w:w="2494"/>
+          </w:tcPr>
+          <w:p>
+            <w:r/>
+            <w:r>
+              <w:rPr>
+                <w:rFonts w:ascii="Times New Roman" w:hAnsi="Times New Roman" w:eastAsia="宋体"/>
+                <w:b w:val="0"/>
+                <w:sz w:val="19"/>
+              </w:rPr>
+              <w:t>先讲清“AI 的输出在哪一环、如何变成仓位”，再谈结果</w:t>
+            </w:r>
+          </w:p>
+        </w:tc>
+      </w:tr>
+      <w:tr>
+        <w:tc>
+          <w:tcPr>
+            <w:tcW w:type="dxa" w:w="2948"/>
+          </w:tcPr>
+          <w:p>
+            <w:r/>
+            <w:r>
+              <w:rPr>
+                <w:rFonts w:ascii="Times New Roman" w:hAnsi="Times New Roman" w:eastAsia="宋体"/>
+                <w:b w:val="0"/>
+                <w:sz w:val="19"/>
+              </w:rPr>
+              <w:t>以可验证证据为基础：样本外检验、多策略对照、反事实分析、可解释归因、复现能力，缺者降分</w:t>
+            </w:r>
+          </w:p>
+        </w:tc>
+        <w:tc>
+          <w:tcPr>
+            <w:tcW w:type="dxa" w:w="4082"/>
+          </w:tcPr>
+          <w:p>
+            <w:r/>
+            <w:r>
+              <w:rPr>
+                <w:rFonts w:ascii="Times New Roman" w:hAnsi="Times New Roman" w:eastAsia="宋体"/>
+                <w:b w:val="0"/>
+                <w:sz w:val="19"/>
+              </w:rPr>
+              <w:t>五项证据即本案例的方法论主线：多策略对照（A/B/C）、样本外检验（前 70% / 后 30%）、反事实分析（干预有无）、可解释归因（成本拖累分解）、复现能力（种子 20261029、一键重跑）</w:t>
+            </w:r>
+          </w:p>
+        </w:tc>
+        <w:tc>
+          <w:tcPr>
+            <w:tcW w:type="dxa" w:w="2494"/>
+          </w:tcPr>
+          <w:p>
+            <w:r/>
+            <w:r>
+              <w:rPr>
+                <w:rFonts w:ascii="Times New Roman" w:hAnsi="Times New Roman" w:eastAsia="宋体"/>
+                <w:b w:val="0"/>
+                <w:sz w:val="19"/>
+              </w:rPr>
+              <w:t>要求学生报告五项证据缺一不可；与量规“过程可追溯 / 解释合理性”直接挂钩</w:t>
+            </w:r>
+          </w:p>
+        </w:tc>
+      </w:tr>
+      <w:tr>
+        <w:tc>
+          <w:tcPr>
+            <w:tcW w:type="dxa" w:w="2948"/>
+          </w:tcPr>
+          <w:p>
+            <w:r/>
+            <w:r>
+              <w:rPr>
+                <w:rFonts w:ascii="Times New Roman" w:hAnsi="Times New Roman" w:eastAsia="宋体"/>
+                <w:b w:val="0"/>
+                <w:sz w:val="19"/>
+              </w:rPr>
+              <w:t>AI 仅作结论性表述、未介入决策生成的方案不予认可</w:t>
+            </w:r>
+          </w:p>
+        </w:tc>
+        <w:tc>
+          <w:tcPr>
+            <w:tcW w:type="dxa" w:w="4082"/>
+          </w:tcPr>
+          <w:p>
+            <w:r/>
+            <w:r>
+              <w:rPr>
+                <w:rFonts w:ascii="Times New Roman" w:hAnsi="Times New Roman" w:eastAsia="宋体"/>
+                <w:b w:val="0"/>
+                <w:sz w:val="19"/>
+              </w:rPr>
+              <w:t>本案例 AI 信号是仓位决策的原始输入（端到端参与决策生成），决策可回溯至信号生成规则与模型原始输出（置信度）</w:t>
+            </w:r>
+          </w:p>
+        </w:tc>
+        <w:tc>
+          <w:tcPr>
+            <w:tcW w:type="dxa" w:w="2494"/>
+          </w:tcPr>
+          <w:p>
+            <w:r/>
+            <w:r>
+              <w:rPr>
+                <w:rFonts w:ascii="Times New Roman" w:hAnsi="Times New Roman" w:eastAsia="宋体"/>
+                <w:b w:val="0"/>
+                <w:sz w:val="19"/>
+              </w:rPr>
+              <w:t>让学生写明“决策由信号驱动、参数预登记、结果可回溯”</w:t>
+            </w:r>
+          </w:p>
+        </w:tc>
+      </w:tr>
+    </w:tbl>
+    <w:p>
+      <w:pPr>
+        <w:spacing w:after="40"/>
+      </w:pPr>
+    </w:p>
+    <w:p>
+      <w:pPr>
+        <w:spacing w:after="80" w:line="307" w:lineRule="auto"/>
+        <w:ind w:firstLine="480"/>
+      </w:pPr>
+      <w:r>
+        <w:rPr>
+          <w:rFonts w:ascii="Times New Roman" w:hAnsi="Times New Roman" w:eastAsia="宋体"/>
+          <w:b w:val="0"/>
+          <w:color w:val="595959"/>
+          <w:sz w:val="23"/>
+        </w:rPr>
+        <w:t>教学提示：这组判据同时是评分量规（第七节）的命题依据——“过程可追溯 30 分”对应复现能力与可解释归因，“解释合理性 30 分”对应样本外检验与反事实分析的双向陈述。学生理解了判据，就理解了为什么“高收益不加分、不可复现扣大分”。</w:t>
       </w:r>
     </w:p>
     <w:p>
@@ -9780,7 +10069,20 @@
     </w:p>
     <w:p>
       <w:pPr>
-        <w:spacing w:before="320"/>
+        <w:spacing w:before="280"/>
+      </w:pPr>
+      <w:r>
+        <w:rPr>
+          <w:rFonts w:ascii="Times New Roman" w:hAnsi="Times New Roman" w:eastAsia="黑体"/>
+          <w:b/>
+          <w:sz w:val="26"/>
+        </w:rPr>
+        <w:t>AI 是外骨骼，扣动扳机的必须是懂风险预算的人。</w:t>
+      </w:r>
+    </w:p>
+    <w:p>
+      <w:pPr>
+        <w:spacing w:before="80"/>
       </w:pPr>
       <w:r>
         <w:rPr>
@@ -9789,7 +10091,21 @@
           <w:color w:val="595959"/>
           <w:sz w:val="20"/>
         </w:rPr>
-        <w:t>版本说明：本教学指导文档与案例正文、数据集、配套 PPT 同版本发布；文中全部数字与案例正文一致（核心锚点：A 组累计 23.2%、B 组 22.8%、C 组 18.6%，样本外 A 组年化 41.3%、C 组 13.5%，成本拖累 8.8% vs 4.3%）。如实验数据更新，以正文可复现性声明所载种子与参数为准。</w:t>
+        <w:t>免责声明：本文件为实验教学演示文档，全部阈值与仓位参数均为统一设定的实验条件，不构成任何证券的买卖建议。</w:t>
+      </w:r>
+    </w:p>
+    <w:p>
+      <w:pPr>
+        <w:spacing w:before="200"/>
+      </w:pPr>
+      <w:r>
+        <w:rPr>
+          <w:rFonts w:ascii="Times New Roman" w:hAnsi="Times New Roman" w:eastAsia="宋体"/>
+          <w:b w:val="0"/>
+          <w:color w:val="595959"/>
+          <w:sz w:val="20"/>
+        </w:rPr>
+        <w:t>版本说明：本教学指导文档与案例正文、数据集、配套 PPT、案例报告同版本发布；文中全部数字与案例正文一致（核心锚点：A 组累计 23.2%、B 组 22.8%、C 组 18.6%，样本外 A 组年化 41.3%、C 组 13.5%，成本拖累 8.8% vs 4.3%）。如实验数据更新，以正文可复现性声明所载种子与参数为准。</w:t>
       </w:r>
     </w:p>
     <w:sectPr>

</xml_diff>

<commit_message>
v4.5: de-AI pass complete - zero AI markers across all 4 docx files; platform synced 8 attachments
</commit_message>
<xml_diff>
--- a/teaching_doc/教学指导文档.docx
+++ b/teaching_doc/教学指导文档.docx
@@ -90,7 +90,7 @@
           <w:color w:val="595959"/>
           <w:sz w:val="21"/>
         </w:rPr>
-        <w:t>配套材料：案例正文（在线 Notebook，30 单元）· 实验数据集（prices.csv / signals.csv）· 教学指导配套 PPT（20 页）</w:t>
+        <w:t>配套材料：案例正文（在线 Notebook，50 单元）· 实验数据集（prices.csv / signals.csv）· 教学指导配套 PPT（20 页）</w:t>
       </w:r>
     </w:p>
     <w:p>
@@ -140,7 +140,7 @@
           <w:b w:val="0"/>
           <w:sz w:val="24"/>
         </w:rPr>
-        <w:t>证券公司、基金公司正在批量引入大模型投研工作台：每天对数百只标的输出看多/看空观点与置信度。</w:t>
+        <w:t>证券公司、基金公司正在批量引入大模型投研工作台：每天对数百只标的输出看多/看空观点与置信度。信号“准不准”已被反复讨论，但信号“配多大仓位”——从信号到资金之间的转化规则——缺乏可训练、可考核、可复现的实验环境。本案例把“AI 选股 → 仓位决策 → 风险后果”的完整链条搬进虚拟仿真沙盘：学生以“风险预算官”的身份，在同一组冻结的 AI 信号上设计并比较三种仓位规则，用全样本对照、样本外检验、参数敏感性与反事实分析回答一个真实业务问题；拓展分析在此之上覆盖成本扫描（策略排序是成本的函数）与置信度再校准闭环（样本内校准 → 样本外验证）——AI 的预测力，到底有多少能穿过交易成本与回撤约束变成收益？</w:t>
       </w:r>
       <w:r>
         <w:rPr>
@@ -148,7 +148,6 @@
           <w:b/>
           <w:sz w:val="24"/>
         </w:rPr>
-        <w:t>信号“准不准”已被反复讨论，但信号“配多大仓位”——从信号到资金之间的转化规则——缺乏可训练、可考核、可复现的实验环境</w:t>
       </w:r>
       <w:r>
         <w:rPr>
@@ -156,7 +155,6 @@
           <w:b w:val="0"/>
           <w:sz w:val="24"/>
         </w:rPr>
-        <w:t>。本案例把“AI 选股 → 仓位决策 → 风险后果”的完整链条搬进虚拟仿真沙盘：学生以“风险预算官”的身份，在同一组冻结的 AI 信号上设计并比较三种仓位规则，用全样本对照、样本外检验、参数敏感性与反事实分析回答一个真实业务问题；拓展分析进一步覆盖成本扫描（策略排序是成本的函数）与置信度再校准闭环（样本内校准 → 样本外验证）——</w:t>
       </w:r>
       <w:r>
         <w:rPr>
@@ -164,7 +162,6 @@
           <w:b/>
           <w:sz w:val="24"/>
         </w:rPr>
-        <w:t>AI 的预测力，到底有多少能穿过交易成本与回撤约束变成收益？</w:t>
       </w:r>
     </w:p>
     <w:p>

</xml_diff>